<commit_message>
fix: update report content for variant 3
</commit_message>
<xml_diff>
--- a/Lab_01/ФеП_32(2)_1_Філяс Максим.docx
+++ b/Lab_01/ФеП_32(2)_1_Філяс Максим.docx
@@ -243,13 +243,10 @@
         <w:jc w:val="both"/>
       </w:pPr>
       <w:r>
-        <w:t>Ознайомитися з основними принципами організації п</w:t>
-      </w:r>
-      <w:r>
-        <w:t>рофесійного Python-проєкту, навчитися створювати ізольоване середовище розробки, використовувати src-layout, модулі та пакети Python, файл pyproject.toml, Git і базову документацію. Практично реалізувати консольний застосунок за індивідуальним варіантом №1</w:t>
-      </w:r>
-      <w:r>
-        <w:t>.</w:t>
+        <w:t xml:space="preserve">Ознайомитися з основними принципами організації професійного Python-проєкту, навчитися створювати ізольоване середовище розробки, використовувати src-layout, модулі та пакети Python, файл pyproject.toml, Git і базову документацію. </w:t>
+      </w:r>
+      <w:r>
+        <w:t>Практично реалізувати консольний застосунок за індивідуальним варіантом №3 («Інтернет-магазин»).</w:t>
       </w:r>
     </w:p>
     <w:p>
@@ -281,10 +278,7 @@
         <w:pStyle w:val="1"/>
       </w:pPr>
       <w:r>
-        <w:t xml:space="preserve">3. Структура </w:t>
-      </w:r>
-      <w:r>
-        <w:t>проєкту</w:t>
+        <w:t>3. Структура проєкту</w:t>
       </w:r>
     </w:p>
     <w:p>
@@ -13736,28 +13730,218 @@
     </w:p>
     <w:p>
       <w:pPr>
+        <w:ind w:firstLine="720"/>
+      </w:pPr>
+      <w:r>
+        <w:lastRenderedPageBreak/>
+        <w:t>import pytest</w:t>
+      </w:r>
+    </w:p>
+    <w:p>
+      <w:pPr>
+        <w:ind w:firstLine="720"/>
+      </w:pPr>
+      <w:r>
+        <w:t>from online_store.models import Product</w:t>
+      </w:r>
+    </w:p>
+    <w:p>
+      <w:pPr>
+        <w:ind w:firstLine="720"/>
+      </w:pPr>
+      <w:r>
+        <w:t>from online_store.services import (</w:t>
+      </w:r>
+    </w:p>
+    <w:p>
+      <w:pPr>
+        <w:ind w:firstLine="720"/>
+      </w:pPr>
+      <w:r>
+        <w:t xml:space="preserve">    add_product,</w:t>
+      </w:r>
+    </w:p>
+    <w:p>
+      <w:pPr>
+        <w:ind w:firstLine="720"/>
+      </w:pPr>
+      <w:r>
+        <w:t xml:space="preserve">    calculate_total_inventory_value,</w:t>
+      </w:r>
+    </w:p>
+    <w:p>
+      <w:pPr>
+        <w:ind w:firstLine="720"/>
+      </w:pPr>
+      <w:r>
+        <w:t xml:space="preserve">    filter_by_category,</w:t>
+      </w:r>
+    </w:p>
+    <w:p>
+      <w:pPr>
+        <w:ind w:firstLine="720"/>
+      </w:pPr>
+      <w:r>
+        <w:t xml:space="preserve">    find_most_expensive_product,</w:t>
+      </w:r>
+    </w:p>
+    <w:p>
+      <w:pPr>
+        <w:ind w:firstLine="720"/>
+      </w:pPr>
+      <w:r>
+        <w:t xml:space="preserve">    find_product_by_name,</w:t>
+      </w:r>
+    </w:p>
+    <w:p>
+      <w:pPr>
+        <w:ind w:firstLine="720"/>
+      </w:pPr>
+      <w:r>
+        <w:t>)</w:t>
+      </w:r>
+    </w:p>
+    <w:p>
+      <w:pPr>
+        <w:ind w:firstLine="720"/>
+      </w:pPr>
+    </w:p>
+    <w:p>
+      <w:pPr>
+        <w:ind w:firstLine="720"/>
+      </w:pPr>
+      <w:r>
+        <w:t>def test_add_product() -&gt; None:</w:t>
+      </w:r>
+    </w:p>
+    <w:p>
+      <w:pPr>
+        <w:ind w:firstLine="720"/>
+      </w:pPr>
+      <w:r>
+        <w:t xml:space="preserve">    products = []</w:t>
+      </w:r>
+    </w:p>
+    <w:p>
+      <w:pPr>
+        <w:ind w:firstLine="720"/>
+      </w:pPr>
+      <w:r>
+        <w:t xml:space="preserve">    product = add_product(products, "Мишка", "Аксесуари", 500.0, 10)</w:t>
+      </w:r>
+    </w:p>
+    <w:p>
+      <w:pPr>
+        <w:ind w:firstLine="720"/>
+      </w:pPr>
+      <w:r>
+        <w:t xml:space="preserve">    assert len(products) == 1</w:t>
+      </w:r>
+    </w:p>
+    <w:p>
+      <w:pPr>
+        <w:ind w:firstLine="720"/>
+      </w:pPr>
+      <w:r>
+        <w:t xml:space="preserve">    assert product.total_value == 5000.0</w:t>
+      </w:r>
+    </w:p>
+    <w:p>
+      <w:pPr>
+        <w:ind w:firstLine="720"/>
+      </w:pPr>
+    </w:p>
+    <w:p>
+      <w:pPr>
+        <w:ind w:firstLine="720"/>
+      </w:pPr>
+      <w:r>
+        <w:t>def test_inventory_value_and_filter() -&gt; None:</w:t>
+      </w:r>
+    </w:p>
+    <w:p>
+      <w:pPr>
+        <w:ind w:firstLine="720"/>
+      </w:pPr>
+      <w:r>
+        <w:t xml:space="preserve">    items = [</w:t>
+      </w:r>
+    </w:p>
+    <w:p>
+      <w:pPr>
+        <w:ind w:firstLine="720"/>
+      </w:pPr>
+      <w:r>
+        <w:t xml:space="preserve">        Product("Ноутбук", "Електроніка", 25000.0, 2),</w:t>
+      </w:r>
+    </w:p>
+    <w:p>
+      <w:pPr>
+        <w:ind w:firstLine="720"/>
+      </w:pPr>
+      <w:r>
+        <w:t xml:space="preserve">        Product("Мишка", "Аксесуари", 500.0, 4),</w:t>
+      </w:r>
+    </w:p>
+    <w:p>
+      <w:pPr>
+        <w:ind w:firstLine="720"/>
+      </w:pPr>
+      <w:r>
+        <w:t xml:space="preserve">    ]</w:t>
+      </w:r>
+    </w:p>
+    <w:p>
+      <w:pPr>
+        <w:ind w:firstLine="720"/>
+      </w:pPr>
+      <w:r>
+        <w:t xml:space="preserve">    assert calculate_total_inventory_value(items) == 52000.0</w:t>
+      </w:r>
+    </w:p>
+    <w:p>
+      <w:pPr>
+        <w:ind w:firstLine="720"/>
+      </w:pPr>
+      <w:r>
+        <w:t xml:space="preserve">    assert len(filter_by_category(items, "Електроніка")) == 1</w:t>
+      </w:r>
+    </w:p>
+    <w:p>
+      <w:pPr>
+        <w:ind w:firstLine="720"/>
+      </w:pPr>
+      <w:r>
+        <w:t xml:space="preserve">    assert find_most_expensive_product(items).name == "Ноутбук"</w:t>
+      </w:r>
+    </w:p>
+    <w:p>
+      <w:pPr>
         <w:pStyle w:val="2"/>
       </w:pPr>
       <w:r>
+        <w:t>4.</w:t>
+      </w:r>
+      <w:r>
+        <w:rPr>
+          <w:lang w:val="uk-UA"/>
+        </w:rPr>
+        <w:t>5</w:t>
+      </w:r>
+      <w:r>
+        <w:t>. exceptions.py</w:t>
+      </w:r>
+    </w:p>
+    <w:p>
+      <w:pPr>
+        <w:ind w:left="720" w:firstLine="720"/>
+      </w:pPr>
+      <w:r>
+        <w:t xml:space="preserve">У модулі exceptions.py реалізовано власну ієрархію винятків для обробки позаштатних ситуацій у роботі магазину. Створено базовий клас винятку StoreError, що </w:t>
+      </w:r>
+      <w:r>
         <w:lastRenderedPageBreak/>
-        <w:t>4.</w:t>
-      </w:r>
-      <w:r>
-        <w:rPr>
-          <w:lang w:val="uk-UA"/>
-        </w:rPr>
-        <w:t>5</w:t>
-      </w:r>
-      <w:r>
-        <w:t>. exceptions.py</w:t>
-      </w:r>
-    </w:p>
-    <w:p>
-      <w:pPr>
-        <w:ind w:left="720" w:firstLine="720"/>
-      </w:pPr>
-      <w:r>
-        <w:t>У модулі exceptions.py реалізовано власну ієрархію винятків для обробки позаштатних ситуацій у роботі магазину. Створено базовий клас винятку StoreError, що успадковується від стандартного класу Exception, та його нащадок InvalidProductDataError, призначений для фіксації помилок валідації атрибутів товару. Використання кастомних винятків замість стандартного ValueError дозволяє чітко розмежувати системні збої та специфічні помилки предметної області, що полегшує перехоплення та локалізацію некоректних даних у блоках try/except на рівні інтерфейсу користувача.</w:t>
+        <w:t>успадковується від стандартного класу Exception, та його нащадок InvalidProductDataError, призначений для фіксації помилок валідації атрибутів товару. Використання кастомних винятків замість стандартного ValueError дозволяє чітко розмежувати системні збої та специфічні помилки предметної області, що полегшує перехоплення та локалізацію некоректних даних у блоках try/except на рівні інтерфейсу користувача.</w:t>
       </w:r>
     </w:p>
     <w:p>
@@ -14155,6 +14339,7 @@
           <w:sz w:val="17"/>
           <w:szCs w:val="17"/>
         </w:rPr>
+        <w:lastRenderedPageBreak/>
         <w:t>online-store = "online_store.main:main"</w:t>
       </w:r>
       <w:r>
@@ -14703,7 +14888,6 @@
           <w:szCs w:val="21"/>
           <w:lang w:val="uk-UA"/>
         </w:rPr>
-        <w:lastRenderedPageBreak/>
         <w:t>```bash</w:t>
       </w:r>
     </w:p>
@@ -14818,74 +15002,75 @@
         <w:pStyle w:val="1"/>
       </w:pPr>
       <w:r>
-        <w:t>8</w:t>
-      </w:r>
-      <w:r>
-        <w:t>. Створення virtual environment та запуск</w:t>
-      </w:r>
-    </w:p>
-    <w:p>
-      <w:pPr>
-        <w:ind w:left="283"/>
-      </w:pPr>
-      <w:r>
-        <w:rPr>
-          <w:rFonts w:ascii="Consolas" w:eastAsia="Consolas" w:hAnsi="Consolas" w:cs="Consolas"/>
-          <w:sz w:val="17"/>
-          <w:szCs w:val="17"/>
-        </w:rPr>
-        <w:t>python -m venv .venv</w:t>
-      </w:r>
-      <w:r>
-        <w:rPr>
-          <w:rFonts w:ascii="Consolas" w:eastAsia="Consolas" w:hAnsi="Consolas" w:cs="Consolas"/>
-          <w:sz w:val="17"/>
-          <w:szCs w:val="17"/>
-        </w:rPr>
-        <w:br/>
-        <w:t>.venv\Scripts\activate</w:t>
-      </w:r>
-      <w:r>
-        <w:rPr>
-          <w:rFonts w:ascii="Consolas" w:eastAsia="Consolas" w:hAnsi="Consolas" w:cs="Consolas"/>
-          <w:sz w:val="17"/>
-          <w:szCs w:val="17"/>
-        </w:rPr>
-        <w:br/>
-      </w:r>
-      <w:r>
-        <w:rPr>
-          <w:rFonts w:ascii="Consolas" w:eastAsia="Consolas" w:hAnsi="Consolas" w:cs="Consolas"/>
-          <w:sz w:val="17"/>
-          <w:szCs w:val="17"/>
-        </w:rPr>
-        <w:t>python -m pip install -e ".[test]"</w:t>
-      </w:r>
-      <w:r>
-        <w:rPr>
-          <w:rFonts w:ascii="Consolas" w:eastAsia="Consolas" w:hAnsi="Consolas" w:cs="Consolas"/>
-          <w:sz w:val="17"/>
-          <w:szCs w:val="17"/>
-        </w:rPr>
-        <w:br/>
-        <w:t xml:space="preserve">python -m </w:t>
-      </w:r>
-      <w:r>
-        <w:rPr>
-          <w:rFonts w:ascii="Consolas" w:eastAsia="Consolas" w:hAnsi="Consolas" w:cs="Consolas"/>
-          <w:sz w:val="17"/>
-          <w:szCs w:val="17"/>
-          <w:lang w:val="en-US"/>
-        </w:rPr>
-        <w:t>lav1</w:t>
-      </w:r>
-      <w:r>
-        <w:rPr>
-          <w:rFonts w:ascii="Consolas" w:eastAsia="Consolas" w:hAnsi="Consolas" w:cs="Consolas"/>
-          <w:sz w:val="17"/>
-          <w:szCs w:val="17"/>
-        </w:rPr>
-        <w:t>.main</w:t>
+        <w:lastRenderedPageBreak/>
+        <w:t>8. Створення virtual environment та запуск</w:t>
+      </w:r>
+    </w:p>
+    <w:p>
+      <w:r>
+        <w:t xml:space="preserve">python </w:t>
+      </w:r>
+      <w:r>
+        <w:rPr>
+          <w:rStyle w:val="hljs-literal"/>
+        </w:rPr>
+        <w:t>-m</w:t>
+      </w:r>
+      <w:r>
+        <w:t xml:space="preserve"> venv .venv</w:t>
+      </w:r>
+    </w:p>
+    <w:p>
+      <w:r>
+        <w:t xml:space="preserve"> .venv\Scripts\activate </w:t>
+      </w:r>
+    </w:p>
+    <w:p>
+      <w:pPr>
+        <w:rPr>
+          <w:rStyle w:val="hljs-string"/>
+        </w:rPr>
+      </w:pPr>
+      <w:r>
+        <w:t xml:space="preserve">python </w:t>
+      </w:r>
+      <w:r>
+        <w:rPr>
+          <w:rStyle w:val="hljs-literal"/>
+        </w:rPr>
+        <w:t>-m</w:t>
+      </w:r>
+      <w:r>
+        <w:t xml:space="preserve"> pip install </w:t>
+      </w:r>
+      <w:r>
+        <w:rPr>
+          <w:rStyle w:val="hljs-literal"/>
+        </w:rPr>
+        <w:t>-e</w:t>
+      </w:r>
+      <w:r>
+        <w:t xml:space="preserve"> </w:t>
+      </w:r>
+      <w:r>
+        <w:rPr>
+          <w:rStyle w:val="hljs-string"/>
+        </w:rPr>
+        <w:t>".[test]"</w:t>
+      </w:r>
+    </w:p>
+    <w:p>
+      <w:r>
+        <w:t xml:space="preserve"> python </w:t>
+      </w:r>
+      <w:r>
+        <w:rPr>
+          <w:rStyle w:val="hljs-literal"/>
+        </w:rPr>
+        <w:t>-m</w:t>
+      </w:r>
+      <w:r>
+        <w:t xml:space="preserve"> online_store.main</w:t>
       </w:r>
     </w:p>
     <w:p>
@@ -16353,18 +16538,37 @@
           <w:sz w:val="17"/>
           <w:szCs w:val="17"/>
         </w:rPr>
-        <w:t>git commit -m "Add application entry point and documentation"</w:t>
-      </w:r>
+        <w:t xml:space="preserve">git commit -m "Add application entry point and documentation" </w:t>
+      </w:r>
+    </w:p>
+    <w:p>
+      <w:pPr>
+        <w:pStyle w:val="2"/>
+      </w:pPr>
+      <w:r>
+        <w:t>10.1. Результат git status</w:t>
+      </w:r>
+    </w:p>
+    <w:p>
+      <w:pPr>
+        <w:ind w:left="283"/>
+      </w:pPr>
       <w:r>
         <w:rPr>
           <w:rFonts w:ascii="Consolas" w:eastAsia="Consolas" w:hAnsi="Consolas" w:cs="Consolas"/>
-          <w:b w:val="0"/>
-          <w:bCs w:val="0"/>
-          <w:color w:val="auto"/>
-          <w:sz w:val="17"/>
-          <w:szCs w:val="17"/>
-        </w:rPr>
-        <w:t xml:space="preserve"> </w:t>
+          <w:sz w:val="17"/>
+          <w:szCs w:val="17"/>
+        </w:rPr>
+        <w:t>On branch master</w:t>
+      </w:r>
+      <w:r>
+        <w:rPr>
+          <w:rFonts w:ascii="Consolas" w:eastAsia="Consolas" w:hAnsi="Consolas" w:cs="Consolas"/>
+          <w:sz w:val="17"/>
+          <w:szCs w:val="17"/>
+        </w:rPr>
+        <w:br/>
+        <w:t>nothing to commit, working tree clean</w:t>
       </w:r>
     </w:p>
     <w:p>
@@ -16372,129 +16576,29 @@
         <w:pStyle w:val="2"/>
       </w:pPr>
       <w:r>
-        <w:t>10.1. Результат git status</w:t>
-      </w:r>
-    </w:p>
-    <w:p>
-      <w:pPr>
-        <w:ind w:left="283"/>
-      </w:pPr>
-      <w:r>
-        <w:rPr>
-          <w:rFonts w:ascii="Consolas" w:eastAsia="Consolas" w:hAnsi="Consolas" w:cs="Consolas"/>
-          <w:sz w:val="17"/>
-          <w:szCs w:val="17"/>
-        </w:rPr>
-        <w:t>On branch master</w:t>
-      </w:r>
-      <w:r>
-        <w:rPr>
-          <w:rFonts w:ascii="Consolas" w:eastAsia="Consolas" w:hAnsi="Consolas" w:cs="Consolas"/>
-          <w:sz w:val="17"/>
-          <w:szCs w:val="17"/>
-        </w:rPr>
-        <w:br/>
-        <w:t xml:space="preserve">nothing </w:t>
-      </w:r>
-      <w:r>
-        <w:rPr>
-          <w:rFonts w:ascii="Consolas" w:eastAsia="Consolas" w:hAnsi="Consolas" w:cs="Consolas"/>
-          <w:sz w:val="17"/>
-          <w:szCs w:val="17"/>
-        </w:rPr>
-        <w:t>to commit, working tree clean</w:t>
-      </w:r>
-    </w:p>
-    <w:p>
-      <w:pPr>
-        <w:pStyle w:val="2"/>
-      </w:pPr>
-      <w:r>
         <w:lastRenderedPageBreak/>
-        <w:t>10.2. Результат git log --oneline</w:t>
-      </w:r>
-    </w:p>
-    <w:p>
-      <w:pPr>
-        <w:pStyle w:val="1"/>
-        <w:rPr>
-          <w:rFonts w:ascii="Consolas" w:eastAsia="Consolas" w:hAnsi="Consolas" w:cs="Consolas"/>
-          <w:b w:val="0"/>
-          <w:bCs w:val="0"/>
-          <w:color w:val="auto"/>
-          <w:sz w:val="17"/>
-          <w:szCs w:val="17"/>
-        </w:rPr>
-      </w:pPr>
-      <w:r>
-        <w:rPr>
-          <w:rFonts w:ascii="Consolas" w:eastAsia="Consolas" w:hAnsi="Consolas" w:cs="Consolas"/>
-          <w:b w:val="0"/>
-          <w:bCs w:val="0"/>
-          <w:color w:val="auto"/>
-          <w:sz w:val="17"/>
-          <w:szCs w:val="17"/>
-        </w:rPr>
-        <w:t>c4a1e2f Add application entry point and documentation</w:t>
-      </w:r>
-    </w:p>
-    <w:p>
-      <w:pPr>
-        <w:pStyle w:val="1"/>
-        <w:rPr>
-          <w:rFonts w:ascii="Consolas" w:eastAsia="Consolas" w:hAnsi="Consolas" w:cs="Consolas"/>
-          <w:b w:val="0"/>
-          <w:bCs w:val="0"/>
-          <w:color w:val="auto"/>
-          <w:sz w:val="17"/>
-          <w:szCs w:val="17"/>
-        </w:rPr>
-      </w:pPr>
-      <w:r>
-        <w:rPr>
-          <w:rFonts w:ascii="Consolas" w:eastAsia="Consolas" w:hAnsi="Consolas" w:cs="Consolas"/>
-          <w:b w:val="0"/>
-          <w:bCs w:val="0"/>
-          <w:color w:val="auto"/>
-          <w:sz w:val="17"/>
-          <w:szCs w:val="17"/>
-        </w:rPr>
-        <w:t>8b1d94a Add product model, services and tests</w:t>
-      </w:r>
-    </w:p>
-    <w:p>
-      <w:pPr>
-        <w:pStyle w:val="1"/>
-        <w:rPr>
-          <w:rFonts w:ascii="Consolas" w:eastAsia="Consolas" w:hAnsi="Consolas" w:cs="Consolas"/>
-          <w:b w:val="0"/>
-          <w:bCs w:val="0"/>
-          <w:color w:val="auto"/>
-          <w:sz w:val="17"/>
-          <w:szCs w:val="17"/>
-        </w:rPr>
-      </w:pPr>
-      <w:r>
-        <w:rPr>
-          <w:rFonts w:ascii="Consolas" w:eastAsia="Consolas" w:hAnsi="Consolas" w:cs="Consolas"/>
-          <w:b w:val="0"/>
-          <w:bCs w:val="0"/>
-          <w:color w:val="auto"/>
-          <w:sz w:val="17"/>
-          <w:szCs w:val="17"/>
-        </w:rPr>
-        <w:t>1a9f3b2 Create project structure</w:t>
-      </w:r>
-      <w:r>
-        <w:rPr>
-          <w:rFonts w:ascii="Consolas" w:eastAsia="Consolas" w:hAnsi="Consolas" w:cs="Consolas"/>
-          <w:b w:val="0"/>
-          <w:bCs w:val="0"/>
-          <w:color w:val="auto"/>
-          <w:sz w:val="17"/>
-          <w:szCs w:val="17"/>
-        </w:rPr>
-        <w:t xml:space="preserve"> </w:t>
+        <w:t xml:space="preserve">10.2. Результат git log </w:t>
+      </w:r>
+      <w:r>
+        <w:t>–</w:t>
+      </w:r>
+      <w:r>
+        <w:t>oneline</w:t>
+      </w:r>
+    </w:p>
+    <w:p>
+      <w:r>
+        <w:t xml:space="preserve">c804288 (HEAD -&gt; master) Add application entry point and documentation </w:t>
+      </w:r>
+    </w:p>
+    <w:p>
+      <w:r>
+        <w:t>c132942 Add product model, services and tests</w:t>
+      </w:r>
+    </w:p>
+    <w:p>
+      <w:r>
+        <w:t xml:space="preserve"> 851007d Create project structure</w:t>
       </w:r>
     </w:p>
     <w:p>
@@ -16784,7 +16888,6 @@
         <w:pStyle w:val="a9"/>
       </w:pPr>
       <w:r>
-        <w:lastRenderedPageBreak/>
         <w:t xml:space="preserve">Для ізоляції залежностей та інтерпретатора конкретного проєкту від інших проєктів і глобальної системи. </w:t>
       </w:r>
     </w:p>
@@ -16830,6 +16933,7 @@
         <w:pStyle w:val="a9"/>
       </w:pPr>
       <w:r>
+        <w:lastRenderedPageBreak/>
         <w:t xml:space="preserve">За допомогою команди </w:t>
       </w:r>
       <w:r>
@@ -17214,7 +17318,6 @@
           <w:rFonts w:hAnsi="Symbol"/>
           <w:lang w:val="en-US"/>
         </w:rPr>
-        <w:lastRenderedPageBreak/>
         <w:t>19.</w:t>
       </w:r>
       <w:r>
@@ -17278,6 +17381,7 @@
         <w:pStyle w:val="a9"/>
       </w:pPr>
       <w:r>
+        <w:lastRenderedPageBreak/>
         <w:t xml:space="preserve">Для перегляду поточного стану робочого каталогу, індексу (staging area) та невідстежуваних файлів. </w:t>
       </w:r>
     </w:p>
@@ -17623,7 +17727,6 @@
         <w:pStyle w:val="a9"/>
       </w:pPr>
       <w:r>
-        <w:lastRenderedPageBreak/>
         <w:t xml:space="preserve">Це набір внутрішніх правил, розрахунків та алгоритмів предметної області без прив'язки до інтерфейсу чи введення/виведення даних. </w:t>
       </w:r>
     </w:p>
@@ -17654,6 +17757,7 @@
         <w:pStyle w:val="a9"/>
       </w:pPr>
       <w:r>
+        <w:lastRenderedPageBreak/>
         <w:t xml:space="preserve">Це дозволяє тестувати та повторно використовувати логіку без залежності від інтерфейсу користувача (CLI, GUI чи API). </w:t>
       </w:r>
     </w:p>
@@ -17662,10 +17766,7 @@
         <w:pStyle w:val="1"/>
       </w:pPr>
       <w:r>
-        <w:t>1</w:t>
-      </w:r>
-      <w:r>
-        <w:t>2. Висновок</w:t>
+        <w:t>12. Висновок</w:t>
       </w:r>
     </w:p>
     <w:p>
@@ -17713,10 +17814,7 @@
         <w:t>, type hints та автоматизованих тестів. Окрім цього, я закріпив на практиці базові команди Git, сформувавши репозиторій із логічною історією комітів.</w:t>
       </w:r>
       <w:r>
-        <w:t>Python-проєкту, роботи з virtual enviro</w:t>
-      </w:r>
-      <w:r>
-        <w:t>nment і Git.</w:t>
+        <w:t>Python-проєкту, роботи з virtual environment і Git.</w:t>
       </w:r>
     </w:p>
     <w:sectPr>
@@ -17783,239 +17881,7 @@
         <w:sz w:val="18"/>
         <w:szCs w:val="18"/>
       </w:rPr>
-      <w:t>Лабо</w:t>
-    </w:r>
-    <w:r>
-      <w:rPr>
-        <w:color w:val="000000"/>
-        <w:sz w:val="18"/>
-        <w:szCs w:val="18"/>
-      </w:rPr>
-      <w:t>р</w:t>
-    </w:r>
-    <w:r>
-      <w:rPr>
-        <w:color w:val="000000"/>
-        <w:sz w:val="18"/>
-        <w:szCs w:val="18"/>
-      </w:rPr>
-      <w:t>а</w:t>
-    </w:r>
-    <w:r>
-      <w:rPr>
-        <w:color w:val="000000"/>
-        <w:sz w:val="18"/>
-        <w:szCs w:val="18"/>
-      </w:rPr>
-      <w:t>т</w:t>
-    </w:r>
-    <w:r>
-      <w:rPr>
-        <w:color w:val="000000"/>
-        <w:sz w:val="18"/>
-        <w:szCs w:val="18"/>
-      </w:rPr>
-      <w:t>о</w:t>
-    </w:r>
-    <w:r>
-      <w:rPr>
-        <w:color w:val="000000"/>
-        <w:sz w:val="18"/>
-        <w:szCs w:val="18"/>
-      </w:rPr>
-      <w:t>р</w:t>
-    </w:r>
-    <w:r>
-      <w:rPr>
-        <w:color w:val="000000"/>
-        <w:sz w:val="18"/>
-        <w:szCs w:val="18"/>
-      </w:rPr>
-      <w:t>н</w:t>
-    </w:r>
-    <w:r>
-      <w:rPr>
-        <w:color w:val="000000"/>
-        <w:sz w:val="18"/>
-        <w:szCs w:val="18"/>
-      </w:rPr>
-      <w:t>а</w:t>
-    </w:r>
-    <w:r>
-      <w:rPr>
-        <w:color w:val="000000"/>
-        <w:sz w:val="18"/>
-        <w:szCs w:val="18"/>
-      </w:rPr>
-      <w:t xml:space="preserve"> </w:t>
-    </w:r>
-    <w:r>
-      <w:rPr>
-        <w:color w:val="000000"/>
-        <w:sz w:val="18"/>
-        <w:szCs w:val="18"/>
-      </w:rPr>
-      <w:t>р</w:t>
-    </w:r>
-    <w:r>
-      <w:rPr>
-        <w:color w:val="000000"/>
-        <w:sz w:val="18"/>
-        <w:szCs w:val="18"/>
-      </w:rPr>
-      <w:t>о</w:t>
-    </w:r>
-    <w:r>
-      <w:rPr>
-        <w:color w:val="000000"/>
-        <w:sz w:val="18"/>
-        <w:szCs w:val="18"/>
-      </w:rPr>
-      <w:t>б</w:t>
-    </w:r>
-    <w:r>
-      <w:rPr>
-        <w:color w:val="000000"/>
-        <w:sz w:val="18"/>
-        <w:szCs w:val="18"/>
-      </w:rPr>
-      <w:t>о</w:t>
-    </w:r>
-    <w:r>
-      <w:rPr>
-        <w:color w:val="000000"/>
-        <w:sz w:val="18"/>
-        <w:szCs w:val="18"/>
-      </w:rPr>
-      <w:t>т</w:t>
-    </w:r>
-    <w:r>
-      <w:rPr>
-        <w:color w:val="000000"/>
-        <w:sz w:val="18"/>
-        <w:szCs w:val="18"/>
-      </w:rPr>
-      <w:t>а</w:t>
-    </w:r>
-    <w:r>
-      <w:rPr>
-        <w:color w:val="000000"/>
-        <w:sz w:val="18"/>
-        <w:szCs w:val="18"/>
-      </w:rPr>
-      <w:t xml:space="preserve"> </w:t>
-    </w:r>
-    <w:r>
-      <w:rPr>
-        <w:color w:val="000000"/>
-        <w:sz w:val="18"/>
-        <w:szCs w:val="18"/>
-      </w:rPr>
-      <w:t>№</w:t>
-    </w:r>
-    <w:r>
-      <w:rPr>
-        <w:color w:val="000000"/>
-        <w:sz w:val="18"/>
-        <w:szCs w:val="18"/>
-      </w:rPr>
-      <w:t>1</w:t>
-    </w:r>
-    <w:r>
-      <w:rPr>
-        <w:color w:val="000000"/>
-        <w:sz w:val="18"/>
-        <w:szCs w:val="18"/>
-      </w:rPr>
-      <w:t xml:space="preserve"> </w:t>
-    </w:r>
-    <w:r>
-      <w:rPr>
-        <w:color w:val="000000"/>
-        <w:sz w:val="18"/>
-        <w:szCs w:val="18"/>
-      </w:rPr>
-      <w:t>|</w:t>
-    </w:r>
-    <w:r>
-      <w:rPr>
-        <w:color w:val="000000"/>
-        <w:sz w:val="18"/>
-        <w:szCs w:val="18"/>
-      </w:rPr>
-      <w:t xml:space="preserve"> </w:t>
-    </w:r>
-    <w:r>
-      <w:rPr>
-        <w:color w:val="000000"/>
-        <w:sz w:val="18"/>
-        <w:szCs w:val="18"/>
-      </w:rPr>
-      <w:t>В</w:t>
-    </w:r>
-    <w:r>
-      <w:rPr>
-        <w:color w:val="000000"/>
-        <w:sz w:val="18"/>
-        <w:szCs w:val="18"/>
-      </w:rPr>
-      <w:t>а</w:t>
-    </w:r>
-    <w:r>
-      <w:rPr>
-        <w:color w:val="000000"/>
-        <w:sz w:val="18"/>
-        <w:szCs w:val="18"/>
-      </w:rPr>
-      <w:t>р</w:t>
-    </w:r>
-    <w:r>
-      <w:rPr>
-        <w:color w:val="000000"/>
-        <w:sz w:val="18"/>
-        <w:szCs w:val="18"/>
-      </w:rPr>
-      <w:t>і</w:t>
-    </w:r>
-    <w:r>
-      <w:rPr>
-        <w:color w:val="000000"/>
-        <w:sz w:val="18"/>
-        <w:szCs w:val="18"/>
-      </w:rPr>
-      <w:t>а</w:t>
-    </w:r>
-    <w:r>
-      <w:rPr>
-        <w:color w:val="000000"/>
-        <w:sz w:val="18"/>
-        <w:szCs w:val="18"/>
-      </w:rPr>
-      <w:t>н</w:t>
-    </w:r>
-    <w:r>
-      <w:rPr>
-        <w:color w:val="000000"/>
-        <w:sz w:val="18"/>
-        <w:szCs w:val="18"/>
-      </w:rPr>
-      <w:t>т</w:t>
-    </w:r>
-    <w:r>
-      <w:rPr>
-        <w:color w:val="000000"/>
-        <w:sz w:val="18"/>
-        <w:szCs w:val="18"/>
-      </w:rPr>
-      <w:t xml:space="preserve"> </w:t>
-    </w:r>
-    <w:r>
-      <w:rPr>
-        <w:color w:val="000000"/>
-        <w:sz w:val="18"/>
-        <w:szCs w:val="18"/>
-      </w:rPr>
-      <w:t>№</w:t>
+      <w:t>Лабораторна робота №1 | Варіант №</w:t>
     </w:r>
     <w:r>
       <w:rPr>
@@ -18802,6 +18668,16 @@
       <w:lang w:val="uk-UA"/>
     </w:rPr>
   </w:style>
+  <w:style w:type="character" w:customStyle="1" w:styleId="hljs-literal">
+    <w:name w:val="hljs-literal"/>
+    <w:basedOn w:val="a0"/>
+    <w:rsid w:val="00AD4769"/>
+  </w:style>
+  <w:style w:type="character" w:customStyle="1" w:styleId="hljs-string">
+    <w:name w:val="hljs-string"/>
+    <w:basedOn w:val="a0"/>
+    <w:rsid w:val="00AD4769"/>
+  </w:style>
 </w:styles>
 </file>
 

</xml_diff>

<commit_message>
fix: align report content with variant 3 requirements
</commit_message>
<xml_diff>
--- a/Lab_01/ФеП_32(2)_1_Філяс Максим.docx
+++ b/Lab_01/ФеП_32(2)_1_Філяс Максим.docx
@@ -262,7 +262,7 @@
         <w:ind w:firstLine="720"/>
       </w:pPr>
       <w:r>
-        <w:t xml:space="preserve">Варіант №3 — «Інтернет-магазин». Для кожного товару зберігати назву, категорію, ціну та кількість. Реалізувати додавання товару, обчислення вартості залишків, пошук товару за назвою, фільтрацію за категорією та визначення найдорожчого товару. </w:t>
+        <w:t>Варіант 3. Інтернет-магазин Для товару зберігати: назву; категорію; ціну; кількість. Реалізувати: додавання товару; обчислення вартості залишків; пошук товару; фільтрацію за категорією; визначення найдорожчого товару.</w:t>
       </w:r>
     </w:p>
     <w:p>
@@ -275,6 +275,55 @@
     </w:p>
     <w:p>
       <w:pPr>
+        <w:ind w:firstLine="720"/>
+      </w:pPr>
+      <w:r>
+        <w:t xml:space="preserve">Під час проєктування консольного застосунку для інтернет-магазину було враховано специфіку предметної області та вимоги до обробки товарних залишків. Архітектура рішення забезпечує повну ізоляцію моделі даних та розрахункових сервісів від користувацького вводу/виводу. </w:t>
+      </w:r>
+    </w:p>
+    <w:p>
+      <w:pPr>
+        <w:ind w:firstLine="720"/>
+      </w:pPr>
+      <w:r>
+        <w:t xml:space="preserve">1. Модель товару та інкапсуляція розрахунків Сутність товару представлена класом Product із базовими атрибутами: назва товару (name), категорія (category), роздрібна ціна (price) та кількість одиниць на складі (quantity). Завдяки використанню декоратора @property, обчислення вартості залишків конкретної товарної позиції виконується динамічно за формулою ціна * кількість, що запобігає розсинхронізації даних під час зміни ціни чи кількості товару. </w:t>
+      </w:r>
+    </w:p>
+    <w:p>
+      <w:pPr>
+        <w:ind w:firstLine="720"/>
+      </w:pPr>
+      <w:r>
+        <w:t xml:space="preserve">2. Агрегація та аналітика залишків Функція calculate_total_inventory_value() виконує агрегацію по всьому асортименту магазину, підсумовуючи загальну вартість залишків усіх збережених товарів. Це дозволяє в режимі реального часу оцінити балансову вартість складу інтернет-магазину без необхідності прямого доступу до бази даних. </w:t>
+      </w:r>
+    </w:p>
+    <w:p>
+      <w:pPr>
+        <w:ind w:firstLine="720"/>
+      </w:pPr>
+      <w:r>
+        <w:t xml:space="preserve">3. Алгоритми пошуку та фільтрації асортименту Для реалізації вимог індивідуального завдання створено два незалежні алгоритми обробки списку товарів: - Пошук товару за назвою (find_product_by_name) виконує нечутливе до регістру порівняння рядків, повертаючи знайдений товар або None, якщо збігів немає. - Фільтрація за категорією (filter_by_category) повертає новий список товарів, що належать до обраної товарної групи (наприклад, «Електроніка», «Аксесуари», «Меблі»), нормалізуючи текст для запобігання помилкам введення. </w:t>
+      </w:r>
+    </w:p>
+    <w:p>
+      <w:pPr>
+        <w:ind w:firstLine="720"/>
+      </w:pPr>
+      <w:r>
+        <w:t xml:space="preserve">4. Визначення найдорожчого товару Алгоритм визначення найдорожчого товару (find_most_expensive_product) базується на виклику функції max із ключем сортування за атрибутом price. У випадку порожнього списку товарів функція безпечно повертає None, що унеможливлює виникнення винятку ValueError під час роботи інтернет-магазину. </w:t>
+      </w:r>
+    </w:p>
+    <w:p>
+      <w:pPr>
+        <w:ind w:firstLine="720"/>
+      </w:pPr>
+      <w:r>
+        <w:lastRenderedPageBreak/>
+        <w:t>5. Валідація та надійність системи Усі операції додавання товару (add_product) захищені попередньою перевіркою параметрів: ціна товару не може набувати від'ємних значень, а кількість товару на складі не може бути меншою за нуль. Порушення цих бізнес-правил призводить до генерації винятку InvalidProductDataError, що гарантує цілісність даних каталогу товарів інтернет-магазину.</w:t>
+      </w:r>
+    </w:p>
+    <w:p>
+      <w:pPr>
         <w:pStyle w:val="1"/>
       </w:pPr>
       <w:r>
@@ -297,7 +346,16 @@
           <w:szCs w:val="17"/>
           <w:lang w:val="en-US"/>
         </w:rPr>
-        <w:t>LAB1</w:t>
+        <w:t>LAB</w:t>
+      </w:r>
+      <w:r>
+        <w:rPr>
+          <w:rFonts w:ascii="Consolas" w:eastAsia="Consolas" w:hAnsi="Consolas" w:cs="Consolas"/>
+          <w:sz w:val="17"/>
+          <w:szCs w:val="17"/>
+          <w:lang w:val="uk-UA"/>
+        </w:rPr>
+        <w:t>_01</w:t>
       </w:r>
       <w:r>
         <w:rPr>
@@ -543,7 +601,6 @@
           <w:szCs w:val="17"/>
           <w:lang w:val="uk-UA"/>
         </w:rPr>
-        <w:lastRenderedPageBreak/>
         <w:t>from</w:t>
       </w:r>
       <w:r>
@@ -1044,6 +1101,7 @@
           <w:szCs w:val="17"/>
           <w:lang w:val="uk-UA"/>
         </w:rPr>
+        <w:lastRenderedPageBreak/>
         <w:t xml:space="preserve">    </w:t>
       </w:r>
       <w:r>
@@ -3326,7 +3384,6 @@
           <w:szCs w:val="17"/>
           <w:lang w:val="uk-UA"/>
         </w:rPr>
-        <w:lastRenderedPageBreak/>
         <w:t>def</w:t>
       </w:r>
       <w:r>
@@ -4357,6 +4414,7 @@
           <w:szCs w:val="17"/>
           <w:lang w:val="uk-UA"/>
         </w:rPr>
+        <w:lastRenderedPageBreak/>
         <w:t xml:space="preserve">    </w:t>
       </w:r>
       <w:r>
@@ -6299,7 +6357,6 @@
           <w:szCs w:val="17"/>
           <w:lang w:val="uk-UA"/>
         </w:rPr>
-        <w:lastRenderedPageBreak/>
         <w:t xml:space="preserve">    </w:t>
       </w:r>
       <w:r>
@@ -7610,6 +7667,7 @@
           <w:szCs w:val="17"/>
           <w:lang w:val="uk-UA"/>
         </w:rPr>
+        <w:lastRenderedPageBreak/>
         <w:t xml:space="preserve">        </w:t>
       </w:r>
       <w:r>
@@ -10472,7 +10530,6 @@
           <w:szCs w:val="17"/>
           <w:lang w:val="uk-UA"/>
         </w:rPr>
-        <w:lastRenderedPageBreak/>
         <w:t xml:space="preserve">    </w:t>
       </w:r>
       <w:r>
@@ -11246,6 +11303,7 @@
           <w:szCs w:val="17"/>
           <w:lang w:val="uk-UA"/>
         </w:rPr>
+        <w:lastRenderedPageBreak/>
         <w:t xml:space="preserve">            </w:t>
       </w:r>
       <w:r>
@@ -13733,8 +13791,56 @@
         <w:ind w:firstLine="720"/>
       </w:pPr>
       <w:r>
+        <w:t>import pytest</w:t>
+      </w:r>
+    </w:p>
+    <w:p>
+      <w:pPr>
+        <w:ind w:firstLine="720"/>
+      </w:pPr>
+      <w:r>
+        <w:t>from online_store.models import Product</w:t>
+      </w:r>
+    </w:p>
+    <w:p>
+      <w:pPr>
+        <w:ind w:firstLine="720"/>
+      </w:pPr>
+      <w:r>
+        <w:t>from online_store.services import (</w:t>
+      </w:r>
+    </w:p>
+    <w:p>
+      <w:pPr>
+        <w:ind w:firstLine="720"/>
+      </w:pPr>
+      <w:r>
+        <w:t xml:space="preserve">    add_product,</w:t>
+      </w:r>
+    </w:p>
+    <w:p>
+      <w:pPr>
+        <w:ind w:firstLine="720"/>
+      </w:pPr>
+      <w:r>
+        <w:t xml:space="preserve">    calculate_total_inventory_value,</w:t>
+      </w:r>
+    </w:p>
+    <w:p>
+      <w:pPr>
+        <w:ind w:firstLine="720"/>
+      </w:pPr>
+      <w:r>
+        <w:t xml:space="preserve">    filter_by_category,</w:t>
+      </w:r>
+    </w:p>
+    <w:p>
+      <w:pPr>
+        <w:ind w:firstLine="720"/>
+      </w:pPr>
+      <w:r>
         <w:lastRenderedPageBreak/>
-        <w:t>import pytest</w:t>
+        <w:t xml:space="preserve">    find_most_expensive_product,</w:t>
       </w:r>
     </w:p>
     <w:p>
@@ -13742,7 +13848,7 @@
         <w:ind w:firstLine="720"/>
       </w:pPr>
       <w:r>
-        <w:t>from online_store.models import Product</w:t>
+        <w:t xml:space="preserve">    find_product_by_name,</w:t>
       </w:r>
     </w:p>
     <w:p>
@@ -13750,23 +13856,20 @@
         <w:ind w:firstLine="720"/>
       </w:pPr>
       <w:r>
-        <w:t>from online_store.services import (</w:t>
+        <w:t>)</w:t>
       </w:r>
     </w:p>
     <w:p>
       <w:pPr>
         <w:ind w:firstLine="720"/>
       </w:pPr>
-      <w:r>
-        <w:t xml:space="preserve">    add_product,</w:t>
-      </w:r>
     </w:p>
     <w:p>
       <w:pPr>
         <w:ind w:firstLine="720"/>
       </w:pPr>
       <w:r>
-        <w:t xml:space="preserve">    calculate_total_inventory_value,</w:t>
+        <w:t>def test_add_product() -&gt; None:</w:t>
       </w:r>
     </w:p>
     <w:p>
@@ -13774,7 +13877,7 @@
         <w:ind w:firstLine="720"/>
       </w:pPr>
       <w:r>
-        <w:t xml:space="preserve">    filter_by_category,</w:t>
+        <w:t xml:space="preserve">    products = []</w:t>
       </w:r>
     </w:p>
     <w:p>
@@ -13782,7 +13885,7 @@
         <w:ind w:firstLine="720"/>
       </w:pPr>
       <w:r>
-        <w:t xml:space="preserve">    find_most_expensive_product,</w:t>
+        <w:t xml:space="preserve">    product = add_product(products, "Мишка", "Аксесуари", 500.0, 10)</w:t>
       </w:r>
     </w:p>
     <w:p>
@@ -13790,7 +13893,7 @@
         <w:ind w:firstLine="720"/>
       </w:pPr>
       <w:r>
-        <w:t xml:space="preserve">    find_product_by_name,</w:t>
+        <w:t xml:space="preserve">    assert len(products) == 1</w:t>
       </w:r>
     </w:p>
     <w:p>
@@ -13798,7 +13901,7 @@
         <w:ind w:firstLine="720"/>
       </w:pPr>
       <w:r>
-        <w:t>)</w:t>
+        <w:t xml:space="preserve">    assert product.total_value == 5000.0</w:t>
       </w:r>
     </w:p>
     <w:p>
@@ -13811,7 +13914,7 @@
         <w:ind w:firstLine="720"/>
       </w:pPr>
       <w:r>
-        <w:t>def test_add_product() -&gt; None:</w:t>
+        <w:t>def test_inventory_value_and_filter() -&gt; None:</w:t>
       </w:r>
     </w:p>
     <w:p>
@@ -13819,7 +13922,7 @@
         <w:ind w:firstLine="720"/>
       </w:pPr>
       <w:r>
-        <w:t xml:space="preserve">    products = []</w:t>
+        <w:t xml:space="preserve">    items = [</w:t>
       </w:r>
     </w:p>
     <w:p>
@@ -13827,7 +13930,7 @@
         <w:ind w:firstLine="720"/>
       </w:pPr>
       <w:r>
-        <w:t xml:space="preserve">    product = add_product(products, "Мишка", "Аксесуари", 500.0, 10)</w:t>
+        <w:t xml:space="preserve">        Product("Ноутбук", "Електроніка", 25000.0, 2),</w:t>
       </w:r>
     </w:p>
     <w:p>
@@ -13835,7 +13938,7 @@
         <w:ind w:firstLine="720"/>
       </w:pPr>
       <w:r>
-        <w:t xml:space="preserve">    assert len(products) == 1</w:t>
+        <w:t xml:space="preserve">        Product("Мишка", "Аксесуари", 500.0, 4),</w:t>
       </w:r>
     </w:p>
     <w:p>
@@ -13843,20 +13946,23 @@
         <w:ind w:firstLine="720"/>
       </w:pPr>
       <w:r>
-        <w:t xml:space="preserve">    assert product.total_value == 5000.0</w:t>
+        <w:t xml:space="preserve">    ]</w:t>
       </w:r>
     </w:p>
     <w:p>
       <w:pPr>
         <w:ind w:firstLine="720"/>
       </w:pPr>
+      <w:r>
+        <w:t xml:space="preserve">    assert calculate_total_inventory_value(items) == 52000.0</w:t>
+      </w:r>
     </w:p>
     <w:p>
       <w:pPr>
         <w:ind w:firstLine="720"/>
       </w:pPr>
       <w:r>
-        <w:t>def test_inventory_value_and_filter() -&gt; None:</w:t>
+        <w:t xml:space="preserve">    assert len(filter_by_category(items, "Електроніка")) == 1</w:t>
       </w:r>
     </w:p>
     <w:p>
@@ -13864,560 +13970,508 @@
         <w:ind w:firstLine="720"/>
       </w:pPr>
       <w:r>
-        <w:t xml:space="preserve">    items = [</w:t>
+        <w:t xml:space="preserve">    assert find_most_expensive_product(items).name == "Ноутбук"</w:t>
+      </w:r>
+    </w:p>
+    <w:p>
+      <w:pPr>
+        <w:pStyle w:val="2"/>
+      </w:pPr>
+      <w:r>
+        <w:t>4.</w:t>
+      </w:r>
+      <w:r>
+        <w:rPr>
+          <w:lang w:val="uk-UA"/>
+        </w:rPr>
+        <w:t>5</w:t>
+      </w:r>
+      <w:r>
+        <w:t>. exceptions.py</w:t>
+      </w:r>
+    </w:p>
+    <w:p>
+      <w:pPr>
+        <w:ind w:left="720" w:firstLine="720"/>
+      </w:pPr>
+      <w:r>
+        <w:t>У модулі exceptions.py реалізовано власну ієрархію винятків для обробки позаштатних ситуацій у роботі магазину. Створено базовий клас винятку StoreError, що успадковується від стандартного класу Exception, та його нащадок InvalidProductDataError, призначений для фіксації помилок валідації атрибутів товару. Використання кастомних винятків замість стандартного ValueError дозволяє чітко розмежувати системні збої та специфічні помилки предметної області, що полегшує перехоплення та локалізацію некоректних даних у блоках try/except на рівні інтерфейсу користувача.</w:t>
       </w:r>
     </w:p>
     <w:p>
       <w:pPr>
         <w:ind w:firstLine="720"/>
-      </w:pPr>
-      <w:r>
-        <w:t xml:space="preserve">        Product("Ноутбук", "Електроніка", 25000.0, 2),</w:t>
+        <w:rPr>
+          <w:rFonts w:ascii="Consolas" w:hAnsi="Consolas"/>
+          <w:sz w:val="17"/>
+          <w:szCs w:val="17"/>
+        </w:rPr>
+      </w:pPr>
+      <w:r>
+        <w:rPr>
+          <w:rFonts w:ascii="Consolas" w:hAnsi="Consolas"/>
+          <w:sz w:val="17"/>
+          <w:szCs w:val="17"/>
+        </w:rPr>
+        <w:t>class StoreError(Exception):</w:t>
       </w:r>
     </w:p>
     <w:p>
       <w:pPr>
         <w:ind w:firstLine="720"/>
-      </w:pPr>
-      <w:r>
-        <w:t xml:space="preserve">        Product("Мишка", "Аксесуари", 500.0, 4),</w:t>
+        <w:rPr>
+          <w:rFonts w:ascii="Consolas" w:hAnsi="Consolas"/>
+          <w:sz w:val="17"/>
+          <w:szCs w:val="17"/>
+        </w:rPr>
+      </w:pPr>
+      <w:r>
+        <w:rPr>
+          <w:rFonts w:ascii="Consolas" w:hAnsi="Consolas"/>
+          <w:sz w:val="17"/>
+          <w:szCs w:val="17"/>
+        </w:rPr>
+        <w:t xml:space="preserve">    """Базовий клас винятків магазину."""</w:t>
       </w:r>
     </w:p>
     <w:p>
       <w:pPr>
         <w:ind w:firstLine="720"/>
-      </w:pPr>
-      <w:r>
-        <w:t xml:space="preserve">    ]</w:t>
-      </w:r>
+        <w:rPr>
+          <w:rFonts w:ascii="Consolas" w:hAnsi="Consolas"/>
+          <w:sz w:val="17"/>
+          <w:szCs w:val="17"/>
+        </w:rPr>
+      </w:pPr>
     </w:p>
     <w:p>
       <w:pPr>
         <w:ind w:firstLine="720"/>
-      </w:pPr>
-      <w:r>
-        <w:t xml:space="preserve">    assert calculate_total_inventory_value(items) == 52000.0</w:t>
-      </w:r>
+        <w:rPr>
+          <w:rFonts w:ascii="Consolas" w:hAnsi="Consolas"/>
+          <w:sz w:val="17"/>
+          <w:szCs w:val="17"/>
+        </w:rPr>
+      </w:pPr>
     </w:p>
     <w:p>
       <w:pPr>
         <w:ind w:firstLine="720"/>
-      </w:pPr>
-      <w:r>
-        <w:t xml:space="preserve">    assert len(filter_by_category(items, "Електроніка")) == 1</w:t>
+        <w:rPr>
+          <w:rFonts w:ascii="Consolas" w:hAnsi="Consolas"/>
+          <w:sz w:val="17"/>
+          <w:szCs w:val="17"/>
+        </w:rPr>
+      </w:pPr>
+      <w:r>
+        <w:rPr>
+          <w:rFonts w:ascii="Consolas" w:hAnsi="Consolas"/>
+          <w:sz w:val="17"/>
+          <w:szCs w:val="17"/>
+        </w:rPr>
+        <w:t>class InvalidProductDataError(StoreError):</w:t>
       </w:r>
     </w:p>
     <w:p>
       <w:pPr>
         <w:ind w:firstLine="720"/>
-      </w:pPr>
-      <w:r>
-        <w:t xml:space="preserve">    assert find_most_expensive_product(items).name == "Ноутбук"</w:t>
-      </w:r>
-    </w:p>
-    <w:p>
-      <w:pPr>
-        <w:pStyle w:val="2"/>
-      </w:pPr>
-      <w:r>
-        <w:t>4.</w:t>
-      </w:r>
-      <w:r>
-        <w:rPr>
-          <w:lang w:val="uk-UA"/>
-        </w:rPr>
-        <w:t>5</w:t>
-      </w:r>
-      <w:r>
-        <w:t>. exceptions.py</w:t>
-      </w:r>
-    </w:p>
-    <w:p>
-      <w:pPr>
-        <w:ind w:left="720" w:firstLine="720"/>
-      </w:pPr>
-      <w:r>
-        <w:t xml:space="preserve">У модулі exceptions.py реалізовано власну ієрархію винятків для обробки позаштатних ситуацій у роботі магазину. Створено базовий клас винятку StoreError, що </w:t>
-      </w:r>
-      <w:r>
+        <w:rPr>
+          <w:rFonts w:ascii="Consolas" w:hAnsi="Consolas"/>
+          <w:sz w:val="17"/>
+          <w:szCs w:val="17"/>
+        </w:rPr>
+      </w:pPr>
+      <w:r>
+        <w:rPr>
+          <w:rFonts w:ascii="Consolas" w:hAnsi="Consolas"/>
+          <w:sz w:val="17"/>
+          <w:szCs w:val="17"/>
+        </w:rPr>
+        <w:t xml:space="preserve">    """Виняток для некоректних атрибутів товару."""</w:t>
+      </w:r>
+    </w:p>
+    <w:p>
+      <w:pPr>
+        <w:pStyle w:val="1"/>
+      </w:pPr>
+      <w:r>
+        <w:t>5. Файл pyproject.toml</w:t>
+      </w:r>
+    </w:p>
+    <w:p>
+      <w:pPr>
+        <w:ind w:left="283" w:firstLine="437"/>
+        <w:rPr>
+          <w:rFonts w:ascii="Consolas" w:eastAsia="Consolas" w:hAnsi="Consolas" w:cs="Consolas"/>
+          <w:sz w:val="17"/>
+          <w:szCs w:val="17"/>
+        </w:rPr>
+      </w:pPr>
+      <w:r>
+        <w:t>Файл конфігурації задає build system setuptools, описує метадані проєкту, встановлює вимогу до версії Python 3.11+, визначає тестову залежність pytest, реєструє console script для швидкого запуску застосунку та налаштовує шляхи для інструменту pytest.</w:t>
+      </w:r>
+      <w:r>
+        <w:rPr>
+          <w:rFonts w:ascii="Consolas" w:eastAsia="Consolas" w:hAnsi="Consolas" w:cs="Consolas"/>
+          <w:sz w:val="17"/>
+          <w:szCs w:val="17"/>
+        </w:rPr>
+        <w:t xml:space="preserve"> </w:t>
+      </w:r>
+    </w:p>
+    <w:p>
+      <w:pPr>
+        <w:ind w:left="283"/>
+        <w:rPr>
+          <w:rFonts w:ascii="Consolas" w:eastAsia="Consolas" w:hAnsi="Consolas" w:cs="Consolas"/>
+          <w:sz w:val="17"/>
+          <w:szCs w:val="17"/>
+        </w:rPr>
+      </w:pPr>
+      <w:r>
+        <w:rPr>
+          <w:rFonts w:ascii="Consolas" w:eastAsia="Consolas" w:hAnsi="Consolas" w:cs="Consolas"/>
+          <w:sz w:val="17"/>
+          <w:szCs w:val="17"/>
+        </w:rPr>
+        <w:t>[build-system]</w:t>
+      </w:r>
+    </w:p>
+    <w:p>
+      <w:pPr>
+        <w:ind w:left="283"/>
+        <w:rPr>
+          <w:rFonts w:ascii="Consolas" w:eastAsia="Consolas" w:hAnsi="Consolas" w:cs="Consolas"/>
+          <w:sz w:val="17"/>
+          <w:szCs w:val="17"/>
+        </w:rPr>
+      </w:pPr>
+      <w:r>
+        <w:rPr>
+          <w:rFonts w:ascii="Consolas" w:eastAsia="Consolas" w:hAnsi="Consolas" w:cs="Consolas"/>
+          <w:sz w:val="17"/>
+          <w:szCs w:val="17"/>
+        </w:rPr>
+        <w:t>requires = ["setuptools&gt;=70"]</w:t>
+      </w:r>
+    </w:p>
+    <w:p>
+      <w:pPr>
+        <w:ind w:left="283"/>
+        <w:rPr>
+          <w:rFonts w:ascii="Consolas" w:eastAsia="Consolas" w:hAnsi="Consolas" w:cs="Consolas"/>
+          <w:sz w:val="17"/>
+          <w:szCs w:val="17"/>
+        </w:rPr>
+      </w:pPr>
+      <w:r>
+        <w:rPr>
+          <w:rFonts w:ascii="Consolas" w:eastAsia="Consolas" w:hAnsi="Consolas" w:cs="Consolas"/>
+          <w:sz w:val="17"/>
+          <w:szCs w:val="17"/>
+        </w:rPr>
+        <w:t>build-backend = "setuptools.build_meta"</w:t>
+      </w:r>
+    </w:p>
+    <w:p>
+      <w:pPr>
+        <w:ind w:left="283"/>
+        <w:rPr>
+          <w:rFonts w:ascii="Consolas" w:eastAsia="Consolas" w:hAnsi="Consolas" w:cs="Consolas"/>
+          <w:sz w:val="17"/>
+          <w:szCs w:val="17"/>
+        </w:rPr>
+      </w:pPr>
+    </w:p>
+    <w:p>
+      <w:pPr>
+        <w:ind w:left="283"/>
+        <w:rPr>
+          <w:rFonts w:ascii="Consolas" w:eastAsia="Consolas" w:hAnsi="Consolas" w:cs="Consolas"/>
+          <w:sz w:val="17"/>
+          <w:szCs w:val="17"/>
+        </w:rPr>
+      </w:pPr>
+      <w:r>
+        <w:rPr>
+          <w:rFonts w:ascii="Consolas" w:eastAsia="Consolas" w:hAnsi="Consolas" w:cs="Consolas"/>
+          <w:sz w:val="17"/>
+          <w:szCs w:val="17"/>
+        </w:rPr>
+        <w:t>[project.optional-dependencies]</w:t>
+      </w:r>
+    </w:p>
+    <w:p>
+      <w:pPr>
+        <w:ind w:left="283"/>
+        <w:rPr>
+          <w:rFonts w:ascii="Consolas" w:eastAsia="Consolas" w:hAnsi="Consolas" w:cs="Consolas"/>
+          <w:sz w:val="17"/>
+          <w:szCs w:val="17"/>
+        </w:rPr>
+      </w:pPr>
+      <w:r>
+        <w:rPr>
+          <w:rFonts w:ascii="Consolas" w:eastAsia="Consolas" w:hAnsi="Consolas" w:cs="Consolas"/>
+          <w:sz w:val="17"/>
+          <w:szCs w:val="17"/>
+        </w:rPr>
+        <w:t>dev = [</w:t>
+      </w:r>
+    </w:p>
+    <w:p>
+      <w:pPr>
+        <w:ind w:left="283"/>
+        <w:rPr>
+          <w:rFonts w:ascii="Consolas" w:eastAsia="Consolas" w:hAnsi="Consolas" w:cs="Consolas"/>
+          <w:sz w:val="17"/>
+          <w:szCs w:val="17"/>
+        </w:rPr>
+      </w:pPr>
+      <w:r>
+        <w:rPr>
+          <w:rFonts w:ascii="Consolas" w:eastAsia="Consolas" w:hAnsi="Consolas" w:cs="Consolas"/>
+          <w:sz w:val="17"/>
+          <w:szCs w:val="17"/>
+        </w:rPr>
+        <w:t xml:space="preserve">    "pytest&gt;=8.0",</w:t>
+      </w:r>
+    </w:p>
+    <w:p>
+      <w:pPr>
+        <w:ind w:left="283"/>
+        <w:rPr>
+          <w:rFonts w:ascii="Consolas" w:eastAsia="Consolas" w:hAnsi="Consolas" w:cs="Consolas"/>
+          <w:sz w:val="17"/>
+          <w:szCs w:val="17"/>
+        </w:rPr>
+      </w:pPr>
+      <w:r>
+        <w:rPr>
+          <w:rFonts w:ascii="Consolas" w:eastAsia="Consolas" w:hAnsi="Consolas" w:cs="Consolas"/>
+          <w:sz w:val="17"/>
+          <w:szCs w:val="17"/>
+        </w:rPr>
+        <w:t>]</w:t>
+      </w:r>
+    </w:p>
+    <w:p>
+      <w:pPr>
+        <w:ind w:left="283"/>
+        <w:rPr>
+          <w:rFonts w:ascii="Consolas" w:eastAsia="Consolas" w:hAnsi="Consolas" w:cs="Consolas"/>
+          <w:sz w:val="17"/>
+          <w:szCs w:val="17"/>
+        </w:rPr>
+      </w:pPr>
+    </w:p>
+    <w:p>
+      <w:pPr>
+        <w:ind w:left="283"/>
+        <w:rPr>
+          <w:rFonts w:ascii="Consolas" w:eastAsia="Consolas" w:hAnsi="Consolas" w:cs="Consolas"/>
+          <w:sz w:val="17"/>
+          <w:szCs w:val="17"/>
+        </w:rPr>
+      </w:pPr>
+      <w:r>
+        <w:rPr>
+          <w:rFonts w:ascii="Consolas" w:eastAsia="Consolas" w:hAnsi="Consolas" w:cs="Consolas"/>
+          <w:sz w:val="17"/>
+          <w:szCs w:val="17"/>
+        </w:rPr>
+        <w:t>[project]</w:t>
+      </w:r>
+    </w:p>
+    <w:p>
+      <w:pPr>
+        <w:ind w:left="283"/>
+        <w:rPr>
+          <w:rFonts w:ascii="Consolas" w:eastAsia="Consolas" w:hAnsi="Consolas" w:cs="Consolas"/>
+          <w:sz w:val="17"/>
+          <w:szCs w:val="17"/>
+        </w:rPr>
+      </w:pPr>
+      <w:r>
+        <w:rPr>
+          <w:rFonts w:ascii="Consolas" w:eastAsia="Consolas" w:hAnsi="Consolas" w:cs="Consolas"/>
+          <w:sz w:val="17"/>
+          <w:szCs w:val="17"/>
+        </w:rPr>
+        <w:t>name = "online-store"</w:t>
+      </w:r>
+    </w:p>
+    <w:p>
+      <w:pPr>
+        <w:ind w:left="283"/>
+        <w:rPr>
+          <w:rFonts w:ascii="Consolas" w:eastAsia="Consolas" w:hAnsi="Consolas" w:cs="Consolas"/>
+          <w:sz w:val="17"/>
+          <w:szCs w:val="17"/>
+        </w:rPr>
+      </w:pPr>
+      <w:r>
+        <w:rPr>
+          <w:rFonts w:ascii="Consolas" w:eastAsia="Consolas" w:hAnsi="Consolas" w:cs="Consolas"/>
+          <w:sz w:val="17"/>
+          <w:szCs w:val="17"/>
+        </w:rPr>
+        <w:t>version = "0.1.0"</w:t>
+      </w:r>
+    </w:p>
+    <w:p>
+      <w:pPr>
+        <w:ind w:left="283"/>
+        <w:rPr>
+          <w:rFonts w:ascii="Consolas" w:eastAsia="Consolas" w:hAnsi="Consolas" w:cs="Consolas"/>
+          <w:sz w:val="17"/>
+          <w:szCs w:val="17"/>
+        </w:rPr>
+      </w:pPr>
+      <w:r>
+        <w:rPr>
+          <w:rFonts w:ascii="Consolas" w:eastAsia="Consolas" w:hAnsi="Consolas" w:cs="Consolas"/>
+          <w:sz w:val="17"/>
+          <w:szCs w:val="17"/>
+        </w:rPr>
+        <w:t>description = "Online store inventory management laboratory project"</w:t>
+      </w:r>
+    </w:p>
+    <w:p>
+      <w:pPr>
+        <w:ind w:left="283"/>
+        <w:rPr>
+          <w:rFonts w:ascii="Consolas" w:eastAsia="Consolas" w:hAnsi="Consolas" w:cs="Consolas"/>
+          <w:sz w:val="17"/>
+          <w:szCs w:val="17"/>
+        </w:rPr>
+      </w:pPr>
+      <w:r>
+        <w:rPr>
+          <w:rFonts w:ascii="Consolas" w:eastAsia="Consolas" w:hAnsi="Consolas" w:cs="Consolas"/>
+          <w:sz w:val="17"/>
+          <w:szCs w:val="17"/>
+        </w:rPr>
+        <w:t>requires-python = "&gt;=3.11"</w:t>
+      </w:r>
+    </w:p>
+    <w:p>
+      <w:pPr>
+        <w:ind w:left="283"/>
+        <w:rPr>
+          <w:rFonts w:ascii="Consolas" w:eastAsia="Consolas" w:hAnsi="Consolas" w:cs="Consolas"/>
+          <w:sz w:val="17"/>
+          <w:szCs w:val="17"/>
+        </w:rPr>
+      </w:pPr>
+    </w:p>
+    <w:p>
+      <w:pPr>
+        <w:ind w:left="283"/>
+        <w:rPr>
+          <w:rFonts w:ascii="Consolas" w:eastAsia="Consolas" w:hAnsi="Consolas" w:cs="Consolas"/>
+          <w:sz w:val="17"/>
+          <w:szCs w:val="17"/>
+        </w:rPr>
+      </w:pPr>
+      <w:r>
+        <w:rPr>
+          <w:rFonts w:ascii="Consolas" w:eastAsia="Consolas" w:hAnsi="Consolas" w:cs="Consolas"/>
+          <w:sz w:val="17"/>
+          <w:szCs w:val="17"/>
+        </w:rPr>
+        <w:t>[project.scripts]</w:t>
+      </w:r>
+    </w:p>
+    <w:p>
+      <w:pPr>
+        <w:ind w:left="283"/>
+      </w:pPr>
+      <w:r>
+        <w:rPr>
+          <w:rFonts w:ascii="Consolas" w:eastAsia="Consolas" w:hAnsi="Consolas" w:cs="Consolas"/>
+          <w:sz w:val="17"/>
+          <w:szCs w:val="17"/>
+        </w:rPr>
+        <w:t>online-store = "online_store.main:main"</w:t>
+      </w:r>
+      <w:r>
+        <w:rPr>
+          <w:rFonts w:ascii="Consolas" w:eastAsia="Consolas" w:hAnsi="Consolas" w:cs="Consolas"/>
+          <w:sz w:val="17"/>
+          <w:szCs w:val="17"/>
+        </w:rPr>
+        <w:br/>
+      </w:r>
+    </w:p>
+    <w:p>
+      <w:pPr>
+        <w:pStyle w:val="1"/>
+      </w:pPr>
+      <w:r>
+        <w:t>6. Файл .gitignore</w:t>
+      </w:r>
+    </w:p>
+    <w:p>
+      <w:pPr>
+        <w:ind w:left="283"/>
+      </w:pPr>
+      <w:r>
+        <w:t>З контролю версій Git виключено директорію віртуального середовища, кеші компілятора байт-коду, кеш тестового фреймворку pytest, службові налаштування середовищ розробки (VS Code), артефакти збірки пакета та локальні змінні оточення.</w:t>
+      </w:r>
+    </w:p>
+    <w:p>
+      <w:pPr>
+        <w:ind w:left="283"/>
+        <w:rPr>
+          <w:rFonts w:ascii="Consolas" w:eastAsia="Consolas" w:hAnsi="Consolas" w:cs="Consolas"/>
+          <w:sz w:val="17"/>
+          <w:szCs w:val="17"/>
+        </w:rPr>
+      </w:pPr>
+      <w:r>
+        <w:rPr>
+          <w:rFonts w:ascii="Consolas" w:eastAsia="Consolas" w:hAnsi="Consolas" w:cs="Consolas"/>
+          <w:sz w:val="17"/>
+          <w:szCs w:val="17"/>
+        </w:rPr>
+        <w:t>.venv/</w:t>
+      </w:r>
+    </w:p>
+    <w:p>
+      <w:pPr>
+        <w:ind w:left="283"/>
+        <w:rPr>
+          <w:rFonts w:ascii="Consolas" w:eastAsia="Consolas" w:hAnsi="Consolas" w:cs="Consolas"/>
+          <w:sz w:val="17"/>
+          <w:szCs w:val="17"/>
+        </w:rPr>
+      </w:pPr>
+      <w:r>
+        <w:rPr>
+          <w:rFonts w:ascii="Consolas" w:eastAsia="Consolas" w:hAnsi="Consolas" w:cs="Consolas"/>
+          <w:sz w:val="17"/>
+          <w:szCs w:val="17"/>
+        </w:rPr>
+        <w:t>__pycache__/</w:t>
+      </w:r>
+    </w:p>
+    <w:p>
+      <w:pPr>
+        <w:ind w:left="283"/>
+        <w:rPr>
+          <w:rFonts w:ascii="Consolas" w:eastAsia="Consolas" w:hAnsi="Consolas" w:cs="Consolas"/>
+          <w:sz w:val="17"/>
+          <w:szCs w:val="17"/>
+        </w:rPr>
+      </w:pPr>
+      <w:r>
+        <w:rPr>
+          <w:rFonts w:ascii="Consolas" w:eastAsia="Consolas" w:hAnsi="Consolas" w:cs="Consolas"/>
+          <w:sz w:val="17"/>
+          <w:szCs w:val="17"/>
+        </w:rPr>
         <w:lastRenderedPageBreak/>
-        <w:t>успадковується від стандартного класу Exception, та його нащадок InvalidProductDataError, призначений для фіксації помилок валідації атрибутів товару. Використання кастомних винятків замість стандартного ValueError дозволяє чітко розмежувати системні збої та специфічні помилки предметної області, що полегшує перехоплення та локалізацію некоректних даних у блоках try/except на рівні інтерфейсу користувача.</w:t>
-      </w:r>
-    </w:p>
-    <w:p>
-      <w:pPr>
-        <w:ind w:firstLine="720"/>
-        <w:rPr>
-          <w:rFonts w:ascii="Consolas" w:hAnsi="Consolas"/>
-          <w:sz w:val="17"/>
-          <w:szCs w:val="17"/>
-        </w:rPr>
-      </w:pPr>
-      <w:r>
-        <w:rPr>
-          <w:rFonts w:ascii="Consolas" w:hAnsi="Consolas"/>
-          <w:sz w:val="17"/>
-          <w:szCs w:val="17"/>
-        </w:rPr>
-        <w:t>class StoreError(Exception):</w:t>
-      </w:r>
-    </w:p>
-    <w:p>
-      <w:pPr>
-        <w:ind w:firstLine="720"/>
-        <w:rPr>
-          <w:rFonts w:ascii="Consolas" w:hAnsi="Consolas"/>
-          <w:sz w:val="17"/>
-          <w:szCs w:val="17"/>
-        </w:rPr>
-      </w:pPr>
-      <w:r>
-        <w:rPr>
-          <w:rFonts w:ascii="Consolas" w:hAnsi="Consolas"/>
-          <w:sz w:val="17"/>
-          <w:szCs w:val="17"/>
-        </w:rPr>
-        <w:t xml:space="preserve">    """Базовий клас винятків магазину."""</w:t>
-      </w:r>
-    </w:p>
-    <w:p>
-      <w:pPr>
-        <w:ind w:firstLine="720"/>
-        <w:rPr>
-          <w:rFonts w:ascii="Consolas" w:hAnsi="Consolas"/>
-          <w:sz w:val="17"/>
-          <w:szCs w:val="17"/>
-        </w:rPr>
-      </w:pPr>
-    </w:p>
-    <w:p>
-      <w:pPr>
-        <w:ind w:firstLine="720"/>
-        <w:rPr>
-          <w:rFonts w:ascii="Consolas" w:hAnsi="Consolas"/>
-          <w:sz w:val="17"/>
-          <w:szCs w:val="17"/>
-        </w:rPr>
-      </w:pPr>
-    </w:p>
-    <w:p>
-      <w:pPr>
-        <w:ind w:firstLine="720"/>
-        <w:rPr>
-          <w:rFonts w:ascii="Consolas" w:hAnsi="Consolas"/>
-          <w:sz w:val="17"/>
-          <w:szCs w:val="17"/>
-        </w:rPr>
-      </w:pPr>
-      <w:r>
-        <w:rPr>
-          <w:rFonts w:ascii="Consolas" w:hAnsi="Consolas"/>
-          <w:sz w:val="17"/>
-          <w:szCs w:val="17"/>
-        </w:rPr>
-        <w:t>class InvalidProductDataError(StoreError):</w:t>
-      </w:r>
-    </w:p>
-    <w:p>
-      <w:pPr>
-        <w:ind w:firstLine="720"/>
-        <w:rPr>
-          <w:rFonts w:ascii="Consolas" w:hAnsi="Consolas"/>
-          <w:sz w:val="17"/>
-          <w:szCs w:val="17"/>
-        </w:rPr>
-      </w:pPr>
-      <w:r>
-        <w:rPr>
-          <w:rFonts w:ascii="Consolas" w:hAnsi="Consolas"/>
-          <w:sz w:val="17"/>
-          <w:szCs w:val="17"/>
-        </w:rPr>
-        <w:t xml:space="preserve">    """Виняток для некоректних атрибутів товару."""</w:t>
-      </w:r>
-    </w:p>
-    <w:p>
-      <w:pPr>
-        <w:pStyle w:val="1"/>
-      </w:pPr>
-      <w:r>
-        <w:t>5. Файл pyproject.toml</w:t>
-      </w:r>
-    </w:p>
-    <w:p>
-      <w:pPr>
-        <w:ind w:left="283" w:firstLine="437"/>
-        <w:rPr>
-          <w:rFonts w:ascii="Consolas" w:eastAsia="Consolas" w:hAnsi="Consolas" w:cs="Consolas"/>
-          <w:sz w:val="17"/>
-          <w:szCs w:val="17"/>
-        </w:rPr>
-      </w:pPr>
-      <w:r>
-        <w:t>Файл конфігурації задає build system setuptools, описує метадані проєкту, встановлює вимогу до версії Python 3.11+, визначає тестову залежність pytest, реєструє console script для швидкого запуску застосунку та налаштовує шляхи для інструменту pytest.</w:t>
-      </w:r>
-      <w:r>
-        <w:rPr>
-          <w:rFonts w:ascii="Consolas" w:eastAsia="Consolas" w:hAnsi="Consolas" w:cs="Consolas"/>
-          <w:sz w:val="17"/>
-          <w:szCs w:val="17"/>
-        </w:rPr>
-        <w:t xml:space="preserve"> </w:t>
-      </w:r>
-    </w:p>
-    <w:p>
-      <w:pPr>
-        <w:ind w:left="283"/>
-        <w:rPr>
-          <w:rFonts w:ascii="Consolas" w:eastAsia="Consolas" w:hAnsi="Consolas" w:cs="Consolas"/>
-          <w:sz w:val="17"/>
-          <w:szCs w:val="17"/>
-        </w:rPr>
-      </w:pPr>
-      <w:r>
-        <w:rPr>
-          <w:rFonts w:ascii="Consolas" w:eastAsia="Consolas" w:hAnsi="Consolas" w:cs="Consolas"/>
-          <w:sz w:val="17"/>
-          <w:szCs w:val="17"/>
-        </w:rPr>
-        <w:t>[build-system]</w:t>
-      </w:r>
-    </w:p>
-    <w:p>
-      <w:pPr>
-        <w:ind w:left="283"/>
-        <w:rPr>
-          <w:rFonts w:ascii="Consolas" w:eastAsia="Consolas" w:hAnsi="Consolas" w:cs="Consolas"/>
-          <w:sz w:val="17"/>
-          <w:szCs w:val="17"/>
-        </w:rPr>
-      </w:pPr>
-      <w:r>
-        <w:rPr>
-          <w:rFonts w:ascii="Consolas" w:eastAsia="Consolas" w:hAnsi="Consolas" w:cs="Consolas"/>
-          <w:sz w:val="17"/>
-          <w:szCs w:val="17"/>
-        </w:rPr>
-        <w:t>requires = ["setuptools&gt;=70"]</w:t>
-      </w:r>
-    </w:p>
-    <w:p>
-      <w:pPr>
-        <w:ind w:left="283"/>
-        <w:rPr>
-          <w:rFonts w:ascii="Consolas" w:eastAsia="Consolas" w:hAnsi="Consolas" w:cs="Consolas"/>
-          <w:sz w:val="17"/>
-          <w:szCs w:val="17"/>
-        </w:rPr>
-      </w:pPr>
-      <w:r>
-        <w:rPr>
-          <w:rFonts w:ascii="Consolas" w:eastAsia="Consolas" w:hAnsi="Consolas" w:cs="Consolas"/>
-          <w:sz w:val="17"/>
-          <w:szCs w:val="17"/>
-        </w:rPr>
-        <w:t>build-backend = "setuptools.build_meta"</w:t>
-      </w:r>
-    </w:p>
-    <w:p>
-      <w:pPr>
-        <w:ind w:left="283"/>
-        <w:rPr>
-          <w:rFonts w:ascii="Consolas" w:eastAsia="Consolas" w:hAnsi="Consolas" w:cs="Consolas"/>
-          <w:sz w:val="17"/>
-          <w:szCs w:val="17"/>
-        </w:rPr>
-      </w:pPr>
-    </w:p>
-    <w:p>
-      <w:pPr>
-        <w:ind w:left="283"/>
-        <w:rPr>
-          <w:rFonts w:ascii="Consolas" w:eastAsia="Consolas" w:hAnsi="Consolas" w:cs="Consolas"/>
-          <w:sz w:val="17"/>
-          <w:szCs w:val="17"/>
-        </w:rPr>
-      </w:pPr>
-      <w:r>
-        <w:rPr>
-          <w:rFonts w:ascii="Consolas" w:eastAsia="Consolas" w:hAnsi="Consolas" w:cs="Consolas"/>
-          <w:sz w:val="17"/>
-          <w:szCs w:val="17"/>
-        </w:rPr>
-        <w:t>[project.optional-dependencies]</w:t>
-      </w:r>
-    </w:p>
-    <w:p>
-      <w:pPr>
-        <w:ind w:left="283"/>
-        <w:rPr>
-          <w:rFonts w:ascii="Consolas" w:eastAsia="Consolas" w:hAnsi="Consolas" w:cs="Consolas"/>
-          <w:sz w:val="17"/>
-          <w:szCs w:val="17"/>
-        </w:rPr>
-      </w:pPr>
-      <w:r>
-        <w:rPr>
-          <w:rFonts w:ascii="Consolas" w:eastAsia="Consolas" w:hAnsi="Consolas" w:cs="Consolas"/>
-          <w:sz w:val="17"/>
-          <w:szCs w:val="17"/>
-        </w:rPr>
-        <w:t>dev = [</w:t>
-      </w:r>
-    </w:p>
-    <w:p>
-      <w:pPr>
-        <w:ind w:left="283"/>
-        <w:rPr>
-          <w:rFonts w:ascii="Consolas" w:eastAsia="Consolas" w:hAnsi="Consolas" w:cs="Consolas"/>
-          <w:sz w:val="17"/>
-          <w:szCs w:val="17"/>
-        </w:rPr>
-      </w:pPr>
-      <w:r>
-        <w:rPr>
-          <w:rFonts w:ascii="Consolas" w:eastAsia="Consolas" w:hAnsi="Consolas" w:cs="Consolas"/>
-          <w:sz w:val="17"/>
-          <w:szCs w:val="17"/>
-        </w:rPr>
-        <w:t xml:space="preserve">    "pytest&gt;=8.0",</w:t>
-      </w:r>
-    </w:p>
-    <w:p>
-      <w:pPr>
-        <w:ind w:left="283"/>
-        <w:rPr>
-          <w:rFonts w:ascii="Consolas" w:eastAsia="Consolas" w:hAnsi="Consolas" w:cs="Consolas"/>
-          <w:sz w:val="17"/>
-          <w:szCs w:val="17"/>
-        </w:rPr>
-      </w:pPr>
-      <w:r>
-        <w:rPr>
-          <w:rFonts w:ascii="Consolas" w:eastAsia="Consolas" w:hAnsi="Consolas" w:cs="Consolas"/>
-          <w:sz w:val="17"/>
-          <w:szCs w:val="17"/>
-        </w:rPr>
-        <w:t>]</w:t>
-      </w:r>
-    </w:p>
-    <w:p>
-      <w:pPr>
-        <w:ind w:left="283"/>
-        <w:rPr>
-          <w:rFonts w:ascii="Consolas" w:eastAsia="Consolas" w:hAnsi="Consolas" w:cs="Consolas"/>
-          <w:sz w:val="17"/>
-          <w:szCs w:val="17"/>
-        </w:rPr>
-      </w:pPr>
-    </w:p>
-    <w:p>
-      <w:pPr>
-        <w:ind w:left="283"/>
-        <w:rPr>
-          <w:rFonts w:ascii="Consolas" w:eastAsia="Consolas" w:hAnsi="Consolas" w:cs="Consolas"/>
-          <w:sz w:val="17"/>
-          <w:szCs w:val="17"/>
-        </w:rPr>
-      </w:pPr>
-      <w:r>
-        <w:rPr>
-          <w:rFonts w:ascii="Consolas" w:eastAsia="Consolas" w:hAnsi="Consolas" w:cs="Consolas"/>
-          <w:sz w:val="17"/>
-          <w:szCs w:val="17"/>
-        </w:rPr>
-        <w:t>[project]</w:t>
-      </w:r>
-    </w:p>
-    <w:p>
-      <w:pPr>
-        <w:ind w:left="283"/>
-        <w:rPr>
-          <w:rFonts w:ascii="Consolas" w:eastAsia="Consolas" w:hAnsi="Consolas" w:cs="Consolas"/>
-          <w:sz w:val="17"/>
-          <w:szCs w:val="17"/>
-        </w:rPr>
-      </w:pPr>
-      <w:r>
-        <w:rPr>
-          <w:rFonts w:ascii="Consolas" w:eastAsia="Consolas" w:hAnsi="Consolas" w:cs="Consolas"/>
-          <w:sz w:val="17"/>
-          <w:szCs w:val="17"/>
-        </w:rPr>
-        <w:t>name = "online-store"</w:t>
-      </w:r>
-    </w:p>
-    <w:p>
-      <w:pPr>
-        <w:ind w:left="283"/>
-        <w:rPr>
-          <w:rFonts w:ascii="Consolas" w:eastAsia="Consolas" w:hAnsi="Consolas" w:cs="Consolas"/>
-          <w:sz w:val="17"/>
-          <w:szCs w:val="17"/>
-        </w:rPr>
-      </w:pPr>
-      <w:r>
-        <w:rPr>
-          <w:rFonts w:ascii="Consolas" w:eastAsia="Consolas" w:hAnsi="Consolas" w:cs="Consolas"/>
-          <w:sz w:val="17"/>
-          <w:szCs w:val="17"/>
-        </w:rPr>
-        <w:t>version = "0.1.0"</w:t>
-      </w:r>
-    </w:p>
-    <w:p>
-      <w:pPr>
-        <w:ind w:left="283"/>
-        <w:rPr>
-          <w:rFonts w:ascii="Consolas" w:eastAsia="Consolas" w:hAnsi="Consolas" w:cs="Consolas"/>
-          <w:sz w:val="17"/>
-          <w:szCs w:val="17"/>
-        </w:rPr>
-      </w:pPr>
-      <w:r>
-        <w:rPr>
-          <w:rFonts w:ascii="Consolas" w:eastAsia="Consolas" w:hAnsi="Consolas" w:cs="Consolas"/>
-          <w:sz w:val="17"/>
-          <w:szCs w:val="17"/>
-        </w:rPr>
-        <w:t>description = "Online store inventory management laboratory project"</w:t>
-      </w:r>
-    </w:p>
-    <w:p>
-      <w:pPr>
-        <w:ind w:left="283"/>
-        <w:rPr>
-          <w:rFonts w:ascii="Consolas" w:eastAsia="Consolas" w:hAnsi="Consolas" w:cs="Consolas"/>
-          <w:sz w:val="17"/>
-          <w:szCs w:val="17"/>
-        </w:rPr>
-      </w:pPr>
-      <w:r>
-        <w:rPr>
-          <w:rFonts w:ascii="Consolas" w:eastAsia="Consolas" w:hAnsi="Consolas" w:cs="Consolas"/>
-          <w:sz w:val="17"/>
-          <w:szCs w:val="17"/>
-        </w:rPr>
-        <w:t>requires-python = "&gt;=3.11"</w:t>
-      </w:r>
-    </w:p>
-    <w:p>
-      <w:pPr>
-        <w:ind w:left="283"/>
-        <w:rPr>
-          <w:rFonts w:ascii="Consolas" w:eastAsia="Consolas" w:hAnsi="Consolas" w:cs="Consolas"/>
-          <w:sz w:val="17"/>
-          <w:szCs w:val="17"/>
-        </w:rPr>
-      </w:pPr>
-    </w:p>
-    <w:p>
-      <w:pPr>
-        <w:ind w:left="283"/>
-        <w:rPr>
-          <w:rFonts w:ascii="Consolas" w:eastAsia="Consolas" w:hAnsi="Consolas" w:cs="Consolas"/>
-          <w:sz w:val="17"/>
-          <w:szCs w:val="17"/>
-        </w:rPr>
-      </w:pPr>
-      <w:r>
-        <w:rPr>
-          <w:rFonts w:ascii="Consolas" w:eastAsia="Consolas" w:hAnsi="Consolas" w:cs="Consolas"/>
-          <w:sz w:val="17"/>
-          <w:szCs w:val="17"/>
-        </w:rPr>
-        <w:t>[project.scripts]</w:t>
-      </w:r>
-    </w:p>
-    <w:p>
-      <w:pPr>
-        <w:ind w:left="283"/>
-      </w:pPr>
-      <w:r>
-        <w:rPr>
-          <w:rFonts w:ascii="Consolas" w:eastAsia="Consolas" w:hAnsi="Consolas" w:cs="Consolas"/>
-          <w:sz w:val="17"/>
-          <w:szCs w:val="17"/>
-        </w:rPr>
-        <w:lastRenderedPageBreak/>
-        <w:t>online-store = "online_store.main:main"</w:t>
-      </w:r>
-      <w:r>
-        <w:rPr>
-          <w:rFonts w:ascii="Consolas" w:eastAsia="Consolas" w:hAnsi="Consolas" w:cs="Consolas"/>
-          <w:sz w:val="17"/>
-          <w:szCs w:val="17"/>
-        </w:rPr>
-        <w:br/>
-      </w:r>
-    </w:p>
-    <w:p>
-      <w:pPr>
-        <w:pStyle w:val="1"/>
-      </w:pPr>
-      <w:r>
-        <w:t>6. Файл .gitignore</w:t>
-      </w:r>
-    </w:p>
-    <w:p>
-      <w:pPr>
-        <w:ind w:left="283"/>
-      </w:pPr>
-      <w:r>
-        <w:t>З контролю версій Git виключено директорію віртуального середовища, кеші компілятора байт-коду, кеш тестового фреймворку pytest, службові налаштування середовищ розробки (VS Code), артефакти збірки пакета та локальні змінні оточення.</w:t>
-      </w:r>
-    </w:p>
-    <w:p>
-      <w:pPr>
-        <w:ind w:left="283"/>
-        <w:rPr>
-          <w:rFonts w:ascii="Consolas" w:eastAsia="Consolas" w:hAnsi="Consolas" w:cs="Consolas"/>
-          <w:sz w:val="17"/>
-          <w:szCs w:val="17"/>
-        </w:rPr>
-      </w:pPr>
-      <w:r>
-        <w:rPr>
-          <w:rFonts w:ascii="Consolas" w:eastAsia="Consolas" w:hAnsi="Consolas" w:cs="Consolas"/>
-          <w:sz w:val="17"/>
-          <w:szCs w:val="17"/>
-        </w:rPr>
-        <w:t>.venv/</w:t>
-      </w:r>
-    </w:p>
-    <w:p>
-      <w:pPr>
-        <w:ind w:left="283"/>
-        <w:rPr>
-          <w:rFonts w:ascii="Consolas" w:eastAsia="Consolas" w:hAnsi="Consolas" w:cs="Consolas"/>
-          <w:sz w:val="17"/>
-          <w:szCs w:val="17"/>
-        </w:rPr>
-      </w:pPr>
-      <w:r>
-        <w:rPr>
-          <w:rFonts w:ascii="Consolas" w:eastAsia="Consolas" w:hAnsi="Consolas" w:cs="Consolas"/>
-          <w:sz w:val="17"/>
-          <w:szCs w:val="17"/>
-        </w:rPr>
-        <w:t>__pycache__/</w:t>
-      </w:r>
-    </w:p>
-    <w:p>
-      <w:pPr>
-        <w:ind w:left="283"/>
-        <w:rPr>
-          <w:rFonts w:ascii="Consolas" w:eastAsia="Consolas" w:hAnsi="Consolas" w:cs="Consolas"/>
-          <w:sz w:val="17"/>
-          <w:szCs w:val="17"/>
-        </w:rPr>
-      </w:pPr>
-      <w:r>
-        <w:rPr>
-          <w:rFonts w:ascii="Consolas" w:eastAsia="Consolas" w:hAnsi="Consolas" w:cs="Consolas"/>
-          <w:sz w:val="17"/>
-          <w:szCs w:val="17"/>
-        </w:rPr>
         <w:t>*.pyc</w:t>
       </w:r>
     </w:p>
@@ -15002,82 +15056,82 @@
         <w:pStyle w:val="1"/>
       </w:pPr>
       <w:r>
+        <w:t>8. Створення virtual environment та запуск</w:t>
+      </w:r>
+    </w:p>
+    <w:p>
+      <w:r>
+        <w:t xml:space="preserve">python </w:t>
+      </w:r>
+      <w:r>
+        <w:rPr>
+          <w:rStyle w:val="hljs-literal"/>
+        </w:rPr>
+        <w:t>-m</w:t>
+      </w:r>
+      <w:r>
+        <w:t xml:space="preserve"> venv .venv</w:t>
+      </w:r>
+    </w:p>
+    <w:p>
+      <w:r>
+        <w:t xml:space="preserve"> .venv\Scripts\activate </w:t>
+      </w:r>
+    </w:p>
+    <w:p>
+      <w:pPr>
+        <w:rPr>
+          <w:rStyle w:val="hljs-string"/>
+        </w:rPr>
+      </w:pPr>
+      <w:r>
+        <w:t xml:space="preserve">python </w:t>
+      </w:r>
+      <w:r>
+        <w:rPr>
+          <w:rStyle w:val="hljs-literal"/>
+        </w:rPr>
+        <w:t>-m</w:t>
+      </w:r>
+      <w:r>
+        <w:t xml:space="preserve"> pip install </w:t>
+      </w:r>
+      <w:r>
+        <w:rPr>
+          <w:rStyle w:val="hljs-literal"/>
+        </w:rPr>
+        <w:t>-e</w:t>
+      </w:r>
+      <w:r>
+        <w:t xml:space="preserve"> </w:t>
+      </w:r>
+      <w:r>
+        <w:rPr>
+          <w:rStyle w:val="hljs-string"/>
+        </w:rPr>
+        <w:t>".[test]"</w:t>
+      </w:r>
+    </w:p>
+    <w:p>
+      <w:r>
+        <w:t xml:space="preserve"> python </w:t>
+      </w:r>
+      <w:r>
+        <w:rPr>
+          <w:rStyle w:val="hljs-literal"/>
+        </w:rPr>
+        <w:t>-m</w:t>
+      </w:r>
+      <w:r>
+        <w:t xml:space="preserve"> online_store.main</w:t>
+      </w:r>
+    </w:p>
+    <w:p>
+      <w:pPr>
+        <w:pStyle w:val="1"/>
+      </w:pPr>
+      <w:r>
         <w:lastRenderedPageBreak/>
-        <w:t>8. Створення virtual environment та запуск</w:t>
-      </w:r>
-    </w:p>
-    <w:p>
-      <w:r>
-        <w:t xml:space="preserve">python </w:t>
-      </w:r>
-      <w:r>
-        <w:rPr>
-          <w:rStyle w:val="hljs-literal"/>
-        </w:rPr>
-        <w:t>-m</w:t>
-      </w:r>
-      <w:r>
-        <w:t xml:space="preserve"> venv .venv</w:t>
-      </w:r>
-    </w:p>
-    <w:p>
-      <w:r>
-        <w:t xml:space="preserve"> .venv\Scripts\activate </w:t>
-      </w:r>
-    </w:p>
-    <w:p>
-      <w:pPr>
-        <w:rPr>
-          <w:rStyle w:val="hljs-string"/>
-        </w:rPr>
-      </w:pPr>
-      <w:r>
-        <w:t xml:space="preserve">python </w:t>
-      </w:r>
-      <w:r>
-        <w:rPr>
-          <w:rStyle w:val="hljs-literal"/>
-        </w:rPr>
-        <w:t>-m</w:t>
-      </w:r>
-      <w:r>
-        <w:t xml:space="preserve"> pip install </w:t>
-      </w:r>
-      <w:r>
-        <w:rPr>
-          <w:rStyle w:val="hljs-literal"/>
-        </w:rPr>
-        <w:t>-e</w:t>
-      </w:r>
-      <w:r>
-        <w:t xml:space="preserve"> </w:t>
-      </w:r>
-      <w:r>
-        <w:rPr>
-          <w:rStyle w:val="hljs-string"/>
-        </w:rPr>
-        <w:t>".[test]"</w:t>
-      </w:r>
-    </w:p>
-    <w:p>
-      <w:r>
-        <w:t xml:space="preserve"> python </w:t>
-      </w:r>
-      <w:r>
-        <w:rPr>
-          <w:rStyle w:val="hljs-literal"/>
-        </w:rPr>
-        <w:t>-m</w:t>
-      </w:r>
-      <w:r>
-        <w:t xml:space="preserve"> online_store.main</w:t>
-      </w:r>
-    </w:p>
-    <w:p>
-      <w:pPr>
-        <w:pStyle w:val="1"/>
-      </w:pPr>
-      <w:r>
         <w:t>9. Результат роботи програми</w:t>
       </w:r>
     </w:p>

</xml_diff>